<commit_message>
Overwrite primary Documentation.docx with latest system design, temporal boundaries, and hallucination mitigation, removing temporary v2 file
</commit_message>
<xml_diff>
--- a/Documentation.docx
+++ b/Documentation.docx
@@ -240,6 +240,142 @@
     <w:p>
       <w:pPr>
         <w:pStyle w:val="Heading1"/>
+        <w:spacing w:before="360" w:after="120"/>
+      </w:pPr>
+      <w:r>
+        <w:rPr>
+          <w:rFonts w:ascii="Arial" w:hAnsi="Arial"/>
+          <w:b/>
+          <w:color w:val="023047"/>
+        </w:rPr>
+        <w:t>5. Temporal Persona Alignment (Pre-1988 Boundary)</w:t>
+      </w:r>
+    </w:p>
+    <w:p>
+      <w:r>
+        <w:t>To ensure the digital twin behaves authentically as Richard Feynman when he was alive, the architecture implements strict temporal boundaries. Feynman passed away on February 15, 1988. Allowing the agent to cite papers, discuss historical events, or reference technologies from after his death would break the realism of the persona. We prevent this using three primary methods:</w:t>
+      </w:r>
+    </w:p>
+    <w:p>
+      <w:pPr>
+        <w:pStyle w:val="ListBullet"/>
+      </w:pPr>
+      <w:r>
+        <w:rPr>
+          <w:b/>
+        </w:rPr>
+        <w:t xml:space="preserve">Chronological RAG Filter: </w:t>
+      </w:r>
+      <w:r>
+        <w:t>The raw vector databases (Chroma and BM25 index) are strictly populated using texts, lecture files, transcripts, and notes written or recorded by Feynman during his lifetime. The document index contains zero references to post-1988 research, avoiding the presence of anachronistic citations in the RAG contexts.</w:t>
+      </w:r>
+    </w:p>
+    <w:p>
+      <w:pPr>
+        <w:pStyle w:val="ListBullet"/>
+      </w:pPr>
+      <w:r>
+        <w:rPr>
+          <w:b/>
+        </w:rPr>
+        <w:t xml:space="preserve">System Prompt Guardrails: </w:t>
+      </w:r>
+      <w:r>
+        <w:t>The system prompt instructs the LLM that it is not an AI, but Dr. Feynman himself. The LLM is explicitly forbidden from citing post-1988 papers or referring to discoveries that occurred after his lifetime. If asked to write citations, it selects papers from his lifetime (e.g. his 1961 path-integral works or his 1985 nanotech outlines).</w:t>
+      </w:r>
+    </w:p>
+    <w:p>
+      <w:pPr>
+        <w:pStyle w:val="ListBullet"/>
+      </w:pPr>
+      <w:r>
+        <w:rPr>
+          <w:b/>
+        </w:rPr>
+        <w:t xml:space="preserve">Anachronism Mitigation Strategy: </w:t>
+      </w:r>
+      <w:r>
+        <w:t>When users prompt Feynman with modern concepts (such as modern transformer models or deep learning architectures), the agent is instructed to respond with his characteristic intellectual curiosity. He approaches them as hypothetical future predictions or abstract first-principles computational architectures, keeping character while admitting the concepts are 'from after his time.'</w:t>
+      </w:r>
+    </w:p>
+    <w:p>
+      <w:pPr>
+        <w:pStyle w:val="Heading1"/>
+        <w:spacing w:before="360" w:after="120"/>
+      </w:pPr>
+      <w:r>
+        <w:rPr>
+          <w:rFonts w:ascii="Arial" w:hAnsi="Arial"/>
+          <w:b/>
+          <w:color w:val="023047"/>
+        </w:rPr>
+        <w:t>6. Hallucination Prevention &amp; Mitigation</w:t>
+      </w:r>
+    </w:p>
+    <w:p>
+      <w:r>
+        <w:t>Hallucination mitigation is critical in educational contexts. We employ four layers of safety checks to ensure the digital twin remains grounded in authentic source materials:</w:t>
+      </w:r>
+    </w:p>
+    <w:p>
+      <w:pPr>
+        <w:pStyle w:val="ListBullet"/>
+      </w:pPr>
+      <w:r>
+        <w:rPr>
+          <w:b/>
+        </w:rPr>
+        <w:t xml:space="preserve">Strict Grounding Constraints: </w:t>
+      </w:r>
+      <w:r>
+        <w:t>The prompt template strictly binds the model's responses to the retrieved hybrid RAG context segments using a rigid prompt clause. The model is penalized for bringing in external knowledge bases when answering factual physics questions.</w:t>
+      </w:r>
+    </w:p>
+    <w:p>
+      <w:pPr>
+        <w:pStyle w:val="ListBullet"/>
+      </w:pPr>
+      <w:r>
+        <w:rPr>
+          <w:b/>
+        </w:rPr>
+        <w:t xml:space="preserve">Intellectual Honesty Injection: </w:t>
+      </w:r>
+      <w:r>
+        <w:t>Feynman's own philosophy of scientific honesty is built into the system prompt. The model is instructed: 'If you don't know something, or if a premise is flawed, bluntly admit it. "I don't know, let's figure it out" is your default stance.' This redirects potential hallucinations into honest admissions.</w:t>
+      </w:r>
+    </w:p>
+    <w:p>
+      <w:pPr>
+        <w:pStyle w:val="ListBullet"/>
+      </w:pPr>
+      <w:r>
+        <w:rPr>
+          <w:b/>
+        </w:rPr>
+        <w:t xml:space="preserve">Retrieved Context Denseness: </w:t>
+      </w:r>
+      <w:r>
+        <w:t>By merging vector embeddings and keyword indexes (BM25), the retrieval accuracy rises, offering a richer context segment. This reduces the need for the model to fill in details from its own parametric memory.</w:t>
+      </w:r>
+    </w:p>
+    <w:p>
+      <w:pPr>
+        <w:pStyle w:val="ListBullet"/>
+      </w:pPr>
+      <w:r>
+        <w:rPr>
+          <w:b/>
+        </w:rPr>
+        <w:t xml:space="preserve">Temperature Controls: </w:t>
+      </w:r>
+      <w:r>
+        <w:t>The temperature parameter is locked at 0.7. This allows enough flexibility for storytelling, jokes, and anecdotes (crucial to Feynman's persona) while keeping his scientific explanations grounded and deterministic.</w:t>
+      </w:r>
+    </w:p>
+    <w:p>
+      <w:pPr>
+        <w:pStyle w:val="Heading1"/>
         <w:spacing w:before="480" w:after="120"/>
       </w:pPr>
       <w:r>
@@ -248,7 +384,7 @@
           <w:b/>
           <w:color w:val="023047"/>
         </w:rPr>
-        <w:t>5. Step-by-Step Data Flow Example</w:t>
+        <w:t>7. Step-by-Step Data Flow Example</w:t>
       </w:r>
     </w:p>
     <w:p>
@@ -394,7 +530,7 @@
           <w:b/>
           <w:color w:val="023047"/>
         </w:rPr>
-        <w:t>6. Resiliency &amp; Client-Side Protections</w:t>
+        <w:t>8. Resiliency &amp; Client-Side Protections</w:t>
       </w:r>
     </w:p>
     <w:p>
@@ -441,7 +577,7 @@
           <w:color w:val="9CA3AF"/>
           <w:sz w:val="17"/>
         </w:rPr>
-        <w:t>AIMS Feynman Twin System Architecture • v1.2.0</w:t>
+        <w:t>AIMS Feynman Twin System Architecture • v1.3.0</w:t>
       </w:r>
     </w:p>
     <w:sectPr>

</xml_diff>

<commit_message>
Add Database & Memory Management details to Markdown and Word documentation
</commit_message>
<xml_diff>
--- a/Documentation.docx
+++ b/Documentation.docx
@@ -376,6 +376,81 @@
     <w:p>
       <w:pPr>
         <w:pStyle w:val="Heading1"/>
+        <w:spacing w:before="360" w:after="120"/>
+      </w:pPr>
+      <w:r>
+        <w:rPr>
+          <w:rFonts w:ascii="Arial" w:hAnsi="Arial"/>
+          <w:b/>
+          <w:color w:val="023047"/>
+        </w:rPr>
+        <w:t>7. Database &amp; Memory Management</w:t>
+      </w:r>
+    </w:p>
+    <w:p>
+      <w:r>
+        <w:t>To handle dialogue persistence, fast semantic retrieval, and real-time context management, the system implements a multi-tier database and memory management architecture:</w:t>
+      </w:r>
+    </w:p>
+    <w:p>
+      <w:pPr>
+        <w:pStyle w:val="ListBullet"/>
+      </w:pPr>
+      <w:r>
+        <w:rPr>
+          <w:b/>
+        </w:rPr>
+        <w:t xml:space="preserve">SQLite Session Grouping: </w:t>
+      </w:r>
+      <w:r>
+        <w:t>Dialogue sessions are partitioned in a local SQLite database (feynman_memory.db) inside the message_store table using connection pooling. Each conversation is grouped by a unique session_id, ensuring independent, secure, and logically segregated history tracking per topic.</w:t>
+      </w:r>
+    </w:p>
+    <w:p>
+      <w:pPr>
+        <w:pStyle w:val="ListBullet"/>
+      </w:pPr>
+      <w:r>
+        <w:rPr>
+          <w:b/>
+        </w:rPr>
+        <w:t xml:space="preserve">LangChain History Caching: </w:t>
+      </w:r>
+      <w:r>
+        <w:t>The agent utilizes RunnableWithMessageHistory to dynamically cache chat messages in-memory during active sessions. This caching reduces the overhead of constant database disk I/O, feeding rolling conversational windows directly to the LLM context chain.</w:t>
+      </w:r>
+    </w:p>
+    <w:p>
+      <w:pPr>
+        <w:pStyle w:val="ListBullet"/>
+      </w:pPr>
+      <w:r>
+        <w:rPr>
+          <w:b/>
+        </w:rPr>
+        <w:t xml:space="preserve">Local Chroma Index Mapping: </w:t>
+      </w:r>
+      <w:r>
+        <w:t>The pre-compiled knowledge base embeddings are mapped to a local disk-based Chroma DB directory (./feynman_twin_db/). This persistent index speeds up dense retrieval by serving pre-computed document vector representations, completely bypassing the need for redundant runtime embedding generation.</w:t>
+      </w:r>
+    </w:p>
+    <w:p>
+      <w:pPr>
+        <w:pStyle w:val="ListBullet"/>
+      </w:pPr>
+      <w:r>
+        <w:rPr>
+          <w:b/>
+        </w:rPr>
+        <w:t xml:space="preserve">Topic Garbage Collection: </w:t>
+      </w:r>
+      <w:r>
+        <w:t>To prevent database bloat, the system features dynamic garbage collection. When a user deletes a session or topic from the UI, a DELETE query is executed on the SQLite message_store (DELETE FROM message_store WHERE session_id = ?), immediately purging metadata and reclaiming storage space.</w:t>
+      </w:r>
+    </w:p>
+    <w:p>
+      <w:pPr>
+        <w:pStyle w:val="Heading1"/>
         <w:spacing w:before="480" w:after="120"/>
       </w:pPr>
       <w:r>
@@ -384,7 +459,7 @@
           <w:b/>
           <w:color w:val="023047"/>
         </w:rPr>
-        <w:t>7. Step-by-Step Data Flow Example</w:t>
+        <w:t>8. Step-by-Step Data Flow Example</w:t>
       </w:r>
     </w:p>
     <w:p>
@@ -530,7 +605,7 @@
           <w:b/>
           <w:color w:val="023047"/>
         </w:rPr>
-        <w:t>8. Resiliency &amp; Client-Side Protections</w:t>
+        <w:t>9. Resiliency &amp; Client-Side Protections</w:t>
       </w:r>
     </w:p>
     <w:p>
@@ -577,7 +652,7 @@
           <w:color w:val="9CA3AF"/>
           <w:sz w:val="17"/>
         </w:rPr>
-        <w:t>AIMS Feynman Twin System Architecture • v1.3.0</w:t>
+        <w:t>AIMS Feynman Twin System Architecture • v1.4.0</w:t>
       </w:r>
     </w:p>
     <w:sectPr>

</xml_diff>

<commit_message>
Organize document formatting, update to premium clean font (Arial) and strict black color theme
</commit_message>
<xml_diff>
--- a/Documentation.docx
+++ b/Documentation.docx
@@ -11,8 +11,8 @@
         <w:rPr>
           <w:rFonts w:ascii="Arial" w:hAnsi="Arial"/>
           <w:b/>
-          <w:color w:val="023047"/>
-          <w:sz w:val="44"/>
+          <w:color w:val="000000"/>
+          <w:sz w:val="40"/>
         </w:rPr>
         <w:t>SYSTEM DESIGN &amp; ARCHITECTURE DOCUMENTATION</w:t>
       </w:r>
@@ -26,8 +26,8 @@
         <w:rPr>
           <w:rFonts w:ascii="Arial" w:hAnsi="Arial"/>
           <w:i/>
-          <w:color w:val="219EBC"/>
-          <w:sz w:val="28"/>
+          <w:color w:val="505050"/>
+          <w:sz w:val="26"/>
         </w:rPr>
         <w:t>Stateful RAG Digital Twin of Dr. Richard Feynman</w:t>
       </w:r>
@@ -41,7 +41,7 @@
         <w:rPr>
           <w:rFonts w:ascii="Arial" w:hAnsi="Arial"/>
           <w:b/>
-          <w:color w:val="023047"/>
+          <w:color w:val="000000"/>
         </w:rPr>
         <w:t>1. Project Goal &amp; Overview</w:t>
       </w:r>
@@ -63,7 +63,7 @@
         <w:rPr>
           <w:rFonts w:ascii="Arial" w:hAnsi="Arial"/>
           <w:b/>
-          <w:color w:val="023047"/>
+          <w:color w:val="000000"/>
         </w:rPr>
         <w:t>2. Technical Stack &amp; Architecture</w:t>
       </w:r>
@@ -124,14 +124,14 @@
         <w:rPr>
           <w:rFonts w:ascii="Arial" w:hAnsi="Arial"/>
           <w:b/>
-          <w:color w:val="023047"/>
+          <w:color w:val="000000"/>
         </w:rPr>
         <w:t>3. Hybrid RAG Retrieval Pipeline</w:t>
       </w:r>
     </w:p>
     <w:p>
       <w:r>
-        <w:t>To grounding Feynman's lessons in actual transcripts, we utilize a dual-structured RAG (Retrieval-Augmented Generation) pipeline. The system merges two independent retrieval pathways:</w:t>
+        <w:t>To ground Feynman's lessons in actual transcripts, we utilize a dual-structured RAG (Retrieval-Augmented Generation) pipeline. The system merges two independent retrieval pathways:</w:t>
       </w:r>
     </w:p>
     <w:p>
@@ -185,7 +185,7 @@
         <w:rPr>
           <w:rFonts w:ascii="Arial" w:hAnsi="Arial"/>
           <w:b/>
-          <w:color w:val="023047"/>
+          <w:color w:val="000000"/>
         </w:rPr>
         <w:t>4. Quantum Memory Matrix &amp; Physics Engine</w:t>
       </w:r>
@@ -246,7 +246,7 @@
         <w:rPr>
           <w:rFonts w:ascii="Arial" w:hAnsi="Arial"/>
           <w:b/>
-          <w:color w:val="023047"/>
+          <w:color w:val="000000"/>
         </w:rPr>
         <w:t>5. Temporal Persona Alignment (Pre-1988 Boundary)</w:t>
       </w:r>
@@ -307,7 +307,7 @@
         <w:rPr>
           <w:rFonts w:ascii="Arial" w:hAnsi="Arial"/>
           <w:b/>
-          <w:color w:val="023047"/>
+          <w:color w:val="000000"/>
         </w:rPr>
         <w:t>6. Hallucination Prevention &amp; Mitigation</w:t>
       </w:r>
@@ -382,7 +382,7 @@
         <w:rPr>
           <w:rFonts w:ascii="Arial" w:hAnsi="Arial"/>
           <w:b/>
-          <w:color w:val="023047"/>
+          <w:color w:val="000000"/>
         </w:rPr>
         <w:t>7. Database &amp; Memory Management</w:t>
       </w:r>
@@ -457,9 +457,9 @@
         <w:rPr>
           <w:rFonts w:ascii="Arial" w:hAnsi="Arial"/>
           <w:b/>
-          <w:color w:val="023047"/>
+          <w:color w:val="000000"/>
         </w:rPr>
-        <w:t>8. Step-by-Step Data Flow Example</w:t>
+        <w:t>8. Step-by-Step Prompt Data Flow Example</w:t>
       </w:r>
     </w:p>
     <w:p>
@@ -480,10 +480,10 @@
         <w:tc>
           <w:tcPr>
             <w:tcW w:type="dxa" w:w="9360"/>
-            <w:shd w:fill="F3F4F6"/>
+            <w:shd w:fill="F2F2F2"/>
             <w:tcBorders>
               <w:top w:val="none"/>
-              <w:left w:val="single" w:sz="24" w:space="0" w:color="219EBC"/>
+              <w:left w:val="single" w:sz="24" w:space="0" w:color="000000"/>
               <w:bottom w:val="none"/>
               <w:right w:val="none"/>
             </w:tcBorders>
@@ -496,7 +496,7 @@
             <w:r>
               <w:rPr>
                 <w:rFonts w:ascii="Courier New" w:hAnsi="Courier New"/>
-                <w:color w:val="1F2937"/>
+                <w:color w:val="000000"/>
                 <w:sz w:val="19"/>
               </w:rPr>
               <w:t>=== PROMPT DATA FLOW TIMELINE: "What is a photon?" ===</w:t>
@@ -603,7 +603,7 @@
         <w:rPr>
           <w:rFonts w:ascii="Arial" w:hAnsi="Arial"/>
           <w:b/>
-          <w:color w:val="023047"/>
+          <w:color w:val="000000"/>
         </w:rPr>
         <w:t>9. Resiliency &amp; Client-Side Protections</w:t>
       </w:r>
@@ -638,6 +638,76 @@
     </w:p>
     <w:p>
       <w:pPr>
+        <w:pStyle w:val="Heading1"/>
+        <w:spacing w:before="360" w:after="120"/>
+      </w:pPr>
+      <w:r>
+        <w:rPr>
+          <w:rFonts w:ascii="Arial" w:hAnsi="Arial"/>
+          <w:b/>
+          <w:color w:val="000000"/>
+        </w:rPr>
+        <w:t>10. Directory Mapping &amp; Repository Policies</w:t>
+      </w:r>
+    </w:p>
+    <w:p>
+      <w:pPr>
+        <w:pStyle w:val="ListBullet"/>
+      </w:pPr>
+      <w:r>
+        <w:rPr>
+          <w:b/>
+        </w:rPr>
+        <w:t xml:space="preserve">static/: </w:t>
+      </w:r>
+      <w:r>
+        <w:t>Clean separation of frontend scripts. Contains index.html (structure), script.js (UI logic, canvas engines, animations), and style.css (styling variables).</w:t>
+      </w:r>
+    </w:p>
+    <w:p>
+      <w:pPr>
+        <w:pStyle w:val="ListBullet"/>
+      </w:pPr>
+      <w:r>
+        <w:rPr>
+          <w:b/>
+        </w:rPr>
+        <w:t xml:space="preserve">feynman_memory.db: </w:t>
+      </w:r>
+      <w:r>
+        <w:t>Local SQLite database storing conversational session history.</w:t>
+      </w:r>
+    </w:p>
+    <w:p>
+      <w:pPr>
+        <w:pStyle w:val="ListBullet"/>
+      </w:pPr>
+      <w:r>
+        <w:rPr>
+          <w:b/>
+        </w:rPr>
+        <w:t xml:space="preserve">feynman_twin_db/: </w:t>
+      </w:r>
+      <w:r>
+        <w:t>Local cache directories hosting vector embeddings database.</w:t>
+      </w:r>
+    </w:p>
+    <w:p>
+      <w:pPr>
+        <w:pStyle w:val="ListBullet"/>
+      </w:pPr>
+      <w:r>
+        <w:rPr>
+          <w:b/>
+        </w:rPr>
+        <w:t xml:space="preserve">.gitignore: </w:t>
+      </w:r>
+      <w:r>
+        <w:t>Strictly ignores local binaries, DB caches, logs, credentials (.env), and python environments (.venv/) to maintain repository hygiene.</w:t>
+      </w:r>
+    </w:p>
+    <w:p>
+      <w:pPr>
         <w:spacing w:before="480"/>
       </w:pPr>
     </w:p>
@@ -649,7 +719,7 @@
         <w:rPr>
           <w:rFonts w:ascii="Arial" w:hAnsi="Arial"/>
           <w:i/>
-          <w:color w:val="9CA3AF"/>
+          <w:color w:val="8C8C8C"/>
           <w:sz w:val="17"/>
         </w:rPr>
         <w:t>AIMS Feynman Twin System Architecture • v1.4.0</w:t>
@@ -1029,8 +1099,8 @@
     <w:qFormat/>
     <w:rsid w:val="00FC693F"/>
     <w:rPr>
-      <w:rFonts w:ascii="Calibri" w:hAnsi="Calibri"/>
-      <w:color w:val="374151"/>
+      <w:rFonts w:ascii="Arial" w:hAnsi="Arial"/>
+      <w:color w:val="000000"/>
       <w:sz w:val="22"/>
     </w:rPr>
   </w:style>

</xml_diff>